<commit_message>
Add initial implementation of Windows Forms application for LAB 6
</commit_message>
<xml_diff>
--- a/LAB_OOSD/LAB6/LAB6_OOSD_HuynhDaiLuc_1250080109.docx
+++ b/LAB_OOSD/LAB6/LAB6_OOSD_HuynhDaiLuc_1250080109.docx
@@ -5232,8 +5232,17 @@
                 <w:rFonts w:eastAsia="SimSun"/>
                 <w:lang w:eastAsia="zh-CN" w:bidi="ar"/>
               </w:rPr>
-              <w:t xml:space="preserve"> kê</w:t>
-            </w:r>
+              <w:t xml:space="preserve"> </w:t>
+            </w:r>
+            <w:proofErr w:type="spellStart"/>
+            <w:r>
+              <w:rPr>
+                <w:rFonts w:eastAsia="SimSun"/>
+                <w:lang w:eastAsia="zh-CN" w:bidi="ar"/>
+              </w:rPr>
+              <w:t>kê</w:t>
+            </w:r>
+            <w:proofErr w:type="spellEnd"/>
           </w:p>
         </w:tc>
       </w:tr>
@@ -26201,6 +26210,9 @@
     </w:p>
     <w:p>
       <w:r>
+        <w:rPr>
+          <w:noProof/>
+        </w:rPr>
         <w:lastRenderedPageBreak/>
         <w:drawing>
           <wp:inline distT="0" distB="0" distL="0" distR="0" wp14:anchorId="30A7F0A5" wp14:editId="2BEBDAAD">
@@ -27762,6 +27774,1637 @@
       </w:r>
       <w:proofErr w:type="spellEnd"/>
     </w:p>
+    <w:p>
+      <w:r>
+        <w:t xml:space="preserve">Use case </w:t>
+      </w:r>
+      <w:proofErr w:type="spellStart"/>
+      <w:r>
+        <w:t>tổng</w:t>
+      </w:r>
+      <w:proofErr w:type="spellEnd"/>
+      <w:r>
+        <w:t xml:space="preserve"> </w:t>
+      </w:r>
+      <w:proofErr w:type="spellStart"/>
+      <w:r>
+        <w:t>quát</w:t>
+      </w:r>
+      <w:proofErr w:type="spellEnd"/>
+    </w:p>
+    <w:p>
+      <w:r>
+        <w:rPr>
+          <w:noProof/>
+        </w:rPr>
+        <w:lastRenderedPageBreak/>
+        <w:drawing>
+          <wp:inline distT="0" distB="0" distL="0" distR="0" wp14:anchorId="40A60DF9" wp14:editId="3D72D9A1">
+            <wp:extent cx="4335780" cy="4274820"/>
+            <wp:effectExtent l="0" t="0" r="0" b="0"/>
+            <wp:docPr id="46" name="Picture 46"/>
+            <wp:cNvGraphicFramePr>
+              <a:graphicFrameLocks xmlns:a="http://schemas.openxmlformats.org/drawingml/2006/main" noChangeAspect="1"/>
+            </wp:cNvGraphicFramePr>
+            <a:graphic xmlns:a="http://schemas.openxmlformats.org/drawingml/2006/main">
+              <a:graphicData uri="http://schemas.openxmlformats.org/drawingml/2006/picture">
+                <pic:pic xmlns:pic="http://schemas.openxmlformats.org/drawingml/2006/picture">
+                  <pic:nvPicPr>
+                    <pic:cNvPr id="0" name="Picture 160"/>
+                    <pic:cNvPicPr>
+                      <a:picLocks noChangeAspect="1" noChangeArrowheads="1"/>
+                    </pic:cNvPicPr>
+                  </pic:nvPicPr>
+                  <pic:blipFill>
+                    <a:blip r:embed="rId6" cstate="print">
+                      <a:extLst>
+                        <a:ext uri="{28A0092B-C50C-407E-A947-70E740481C1C}">
+                          <a14:useLocalDpi xmlns:a14="http://schemas.microsoft.com/office/drawing/2010/main" val="0"/>
+                        </a:ext>
+                      </a:extLst>
+                    </a:blip>
+                    <a:srcRect/>
+                    <a:stretch>
+                      <a:fillRect/>
+                    </a:stretch>
+                  </pic:blipFill>
+                  <pic:spPr bwMode="auto">
+                    <a:xfrm>
+                      <a:off x="0" y="0"/>
+                      <a:ext cx="4335780" cy="4274820"/>
+                    </a:xfrm>
+                    <a:prstGeom prst="rect">
+                      <a:avLst/>
+                    </a:prstGeom>
+                    <a:noFill/>
+                    <a:ln>
+                      <a:noFill/>
+                    </a:ln>
+                  </pic:spPr>
+                </pic:pic>
+              </a:graphicData>
+            </a:graphic>
+          </wp:inline>
+        </w:drawing>
+      </w:r>
+    </w:p>
+    <w:p/>
+    <w:p>
+      <w:r>
+        <w:t xml:space="preserve">Uc1: </w:t>
+      </w:r>
+      <w:proofErr w:type="spellStart"/>
+      <w:r>
+        <w:t>Đăng</w:t>
+      </w:r>
+      <w:proofErr w:type="spellEnd"/>
+      <w:r>
+        <w:t xml:space="preserve"> </w:t>
+      </w:r>
+      <w:proofErr w:type="spellStart"/>
+      <w:r>
+        <w:t>ký</w:t>
+      </w:r>
+      <w:proofErr w:type="spellEnd"/>
+      <w:r>
+        <w:t xml:space="preserve"> </w:t>
+      </w:r>
+      <w:proofErr w:type="spellStart"/>
+      <w:r>
+        <w:t>khám</w:t>
+      </w:r>
+      <w:proofErr w:type="spellEnd"/>
+      <w:r>
+        <w:t xml:space="preserve"> </w:t>
+      </w:r>
+      <w:proofErr w:type="spellStart"/>
+      <w:r>
+        <w:t>bệnh</w:t>
+      </w:r>
+      <w:proofErr w:type="spellEnd"/>
+      <w:r>
+        <w:t xml:space="preserve"> ban </w:t>
+      </w:r>
+      <w:proofErr w:type="spellStart"/>
+      <w:r>
+        <w:t>đầu</w:t>
+      </w:r>
+      <w:proofErr w:type="spellEnd"/>
+      <w:r>
+        <w:t xml:space="preserve"> &amp; </w:t>
+      </w:r>
+      <w:proofErr w:type="spellStart"/>
+      <w:r>
+        <w:t>Cấp</w:t>
+      </w:r>
+      <w:proofErr w:type="spellEnd"/>
+      <w:r>
+        <w:t xml:space="preserve"> </w:t>
+      </w:r>
+      <w:proofErr w:type="spellStart"/>
+      <w:r>
+        <w:t>Hồ</w:t>
+      </w:r>
+      <w:proofErr w:type="spellEnd"/>
+      <w:r>
+        <w:t xml:space="preserve"> </w:t>
+      </w:r>
+      <w:proofErr w:type="spellStart"/>
+      <w:r>
+        <w:t>sơ</w:t>
+      </w:r>
+      <w:proofErr w:type="spellEnd"/>
+      <w:r>
+        <w:t xml:space="preserve"> </w:t>
+      </w:r>
+      <w:proofErr w:type="spellStart"/>
+      <w:r>
+        <w:t>bệnh</w:t>
+      </w:r>
+      <w:proofErr w:type="spellEnd"/>
+      <w:r>
+        <w:t xml:space="preserve"> </w:t>
+      </w:r>
+      <w:proofErr w:type="spellStart"/>
+      <w:r>
+        <w:t>án</w:t>
+      </w:r>
+      <w:proofErr w:type="spellEnd"/>
+    </w:p>
+    <w:p>
+      <w:r>
+        <w:rPr>
+          <w:noProof/>
+        </w:rPr>
+        <w:drawing>
+          <wp:inline distT="0" distB="0" distL="0" distR="0" wp14:anchorId="7A13DCF6" wp14:editId="6710C3A6">
+            <wp:extent cx="4251960" cy="2956560"/>
+            <wp:effectExtent l="0" t="0" r="0" b="0"/>
+            <wp:docPr id="2" name="Picture 2"/>
+            <wp:cNvGraphicFramePr>
+              <a:graphicFrameLocks xmlns:a="http://schemas.openxmlformats.org/drawingml/2006/main" noChangeAspect="1"/>
+            </wp:cNvGraphicFramePr>
+            <a:graphic xmlns:a="http://schemas.openxmlformats.org/drawingml/2006/main">
+              <a:graphicData uri="http://schemas.openxmlformats.org/drawingml/2006/picture">
+                <pic:pic xmlns:pic="http://schemas.openxmlformats.org/drawingml/2006/picture">
+                  <pic:nvPicPr>
+                    <pic:cNvPr id="0" name="Picture 6"/>
+                    <pic:cNvPicPr>
+                      <a:picLocks noChangeAspect="1" noChangeArrowheads="1"/>
+                    </pic:cNvPicPr>
+                  </pic:nvPicPr>
+                  <pic:blipFill>
+                    <a:blip r:embed="rId7" cstate="print">
+                      <a:extLst>
+                        <a:ext uri="{28A0092B-C50C-407E-A947-70E740481C1C}">
+                          <a14:useLocalDpi xmlns:a14="http://schemas.microsoft.com/office/drawing/2010/main" val="0"/>
+                        </a:ext>
+                      </a:extLst>
+                    </a:blip>
+                    <a:srcRect/>
+                    <a:stretch>
+                      <a:fillRect/>
+                    </a:stretch>
+                  </pic:blipFill>
+                  <pic:spPr bwMode="auto">
+                    <a:xfrm>
+                      <a:off x="0" y="0"/>
+                      <a:ext cx="4251960" cy="2956560"/>
+                    </a:xfrm>
+                    <a:prstGeom prst="rect">
+                      <a:avLst/>
+                    </a:prstGeom>
+                    <a:noFill/>
+                    <a:ln>
+                      <a:noFill/>
+                    </a:ln>
+                  </pic:spPr>
+                </pic:pic>
+              </a:graphicData>
+            </a:graphic>
+          </wp:inline>
+        </w:drawing>
+      </w:r>
+    </w:p>
+    <w:p>
+      <w:r>
+        <w:lastRenderedPageBreak/>
+        <w:t>Activity</w:t>
+      </w:r>
+    </w:p>
+    <w:p>
+      <w:r>
+        <w:rPr>
+          <w:noProof/>
+        </w:rPr>
+        <w:drawing>
+          <wp:inline distT="0" distB="0" distL="0" distR="0" wp14:anchorId="092EA1EE" wp14:editId="5D06ED25">
+            <wp:extent cx="4770120" cy="2636520"/>
+            <wp:effectExtent l="0" t="0" r="0" b="0"/>
+            <wp:docPr id="28" name="Picture 28"/>
+            <wp:cNvGraphicFramePr>
+              <a:graphicFrameLocks xmlns:a="http://schemas.openxmlformats.org/drawingml/2006/main" noChangeAspect="1"/>
+            </wp:cNvGraphicFramePr>
+            <a:graphic xmlns:a="http://schemas.openxmlformats.org/drawingml/2006/main">
+              <a:graphicData uri="http://schemas.openxmlformats.org/drawingml/2006/picture">
+                <pic:pic xmlns:pic="http://schemas.openxmlformats.org/drawingml/2006/picture">
+                  <pic:nvPicPr>
+                    <pic:cNvPr id="0" name="Picture 97"/>
+                    <pic:cNvPicPr>
+                      <a:picLocks noChangeAspect="1" noChangeArrowheads="1"/>
+                    </pic:cNvPicPr>
+                  </pic:nvPicPr>
+                  <pic:blipFill>
+                    <a:blip r:embed="rId8" cstate="print">
+                      <a:extLst>
+                        <a:ext uri="{28A0092B-C50C-407E-A947-70E740481C1C}">
+                          <a14:useLocalDpi xmlns:a14="http://schemas.microsoft.com/office/drawing/2010/main" val="0"/>
+                        </a:ext>
+                      </a:extLst>
+                    </a:blip>
+                    <a:srcRect/>
+                    <a:stretch>
+                      <a:fillRect/>
+                    </a:stretch>
+                  </pic:blipFill>
+                  <pic:spPr bwMode="auto">
+                    <a:xfrm>
+                      <a:off x="0" y="0"/>
+                      <a:ext cx="4770120" cy="2636520"/>
+                    </a:xfrm>
+                    <a:prstGeom prst="rect">
+                      <a:avLst/>
+                    </a:prstGeom>
+                    <a:noFill/>
+                    <a:ln>
+                      <a:noFill/>
+                    </a:ln>
+                  </pic:spPr>
+                </pic:pic>
+              </a:graphicData>
+            </a:graphic>
+          </wp:inline>
+        </w:drawing>
+      </w:r>
+    </w:p>
+    <w:p>
+      <w:r>
+        <w:t>Sequence</w:t>
+      </w:r>
+    </w:p>
+    <w:p/>
+    <w:p>
+      <w:r>
+        <w:rPr>
+          <w:noProof/>
+        </w:rPr>
+        <w:drawing>
+          <wp:inline distT="0" distB="0" distL="0" distR="0" wp14:anchorId="6DC47B6E" wp14:editId="25C026BF">
+            <wp:extent cx="5105400" cy="3604260"/>
+            <wp:effectExtent l="0" t="0" r="0" b="0"/>
+            <wp:docPr id="30" name="Picture 30"/>
+            <wp:cNvGraphicFramePr>
+              <a:graphicFrameLocks xmlns:a="http://schemas.openxmlformats.org/drawingml/2006/main" noChangeAspect="1"/>
+            </wp:cNvGraphicFramePr>
+            <a:graphic xmlns:a="http://schemas.openxmlformats.org/drawingml/2006/main">
+              <a:graphicData uri="http://schemas.openxmlformats.org/drawingml/2006/picture">
+                <pic:pic xmlns:pic="http://schemas.openxmlformats.org/drawingml/2006/picture">
+                  <pic:nvPicPr>
+                    <pic:cNvPr id="0" name="Picture 104"/>
+                    <pic:cNvPicPr>
+                      <a:picLocks noChangeAspect="1" noChangeArrowheads="1"/>
+                    </pic:cNvPicPr>
+                  </pic:nvPicPr>
+                  <pic:blipFill rotWithShape="1">
+                    <a:blip r:embed="rId9" cstate="print">
+                      <a:extLst>
+                        <a:ext uri="{28A0092B-C50C-407E-A947-70E740481C1C}">
+                          <a14:useLocalDpi xmlns:a14="http://schemas.microsoft.com/office/drawing/2010/main" val="0"/>
+                        </a:ext>
+                      </a:extLst>
+                    </a:blip>
+                    <a:srcRect r="740" b="16602"/>
+                    <a:stretch/>
+                  </pic:blipFill>
+                  <pic:spPr bwMode="auto">
+                    <a:xfrm>
+                      <a:off x="0" y="0"/>
+                      <a:ext cx="5105400" cy="3604260"/>
+                    </a:xfrm>
+                    <a:prstGeom prst="rect">
+                      <a:avLst/>
+                    </a:prstGeom>
+                    <a:noFill/>
+                    <a:ln>
+                      <a:noFill/>
+                    </a:ln>
+                    <a:extLst>
+                      <a:ext uri="{53640926-AAD7-44D8-BBD7-CCE9431645EC}">
+                        <a14:shadowObscured xmlns:a14="http://schemas.microsoft.com/office/drawing/2010/main"/>
+                      </a:ext>
+                    </a:extLst>
+                  </pic:spPr>
+                </pic:pic>
+              </a:graphicData>
+            </a:graphic>
+          </wp:inline>
+        </w:drawing>
+      </w:r>
+    </w:p>
+    <w:p/>
+    <w:p/>
+    <w:p>
+      <w:r>
+        <w:lastRenderedPageBreak/>
+        <w:t xml:space="preserve">Uc2: </w:t>
+      </w:r>
+      <w:r>
+        <w:t xml:space="preserve">Thu / Gia </w:t>
+      </w:r>
+      <w:proofErr w:type="spellStart"/>
+      <w:r>
+        <w:t>hạn</w:t>
+      </w:r>
+      <w:proofErr w:type="spellEnd"/>
+      <w:r>
+        <w:t xml:space="preserve"> </w:t>
+      </w:r>
+      <w:proofErr w:type="spellStart"/>
+      <w:r>
+        <w:t>lệ</w:t>
+      </w:r>
+      <w:proofErr w:type="spellEnd"/>
+      <w:r>
+        <w:t xml:space="preserve"> </w:t>
+      </w:r>
+      <w:proofErr w:type="spellStart"/>
+      <w:r>
+        <w:t>phí</w:t>
+      </w:r>
+      <w:proofErr w:type="spellEnd"/>
+      <w:r>
+        <w:t xml:space="preserve"> </w:t>
+      </w:r>
+      <w:proofErr w:type="spellStart"/>
+      <w:r>
+        <w:t>hằng</w:t>
+      </w:r>
+      <w:proofErr w:type="spellEnd"/>
+      <w:r>
+        <w:t xml:space="preserve"> </w:t>
+      </w:r>
+      <w:proofErr w:type="spellStart"/>
+      <w:r>
+        <w:t>năm</w:t>
+      </w:r>
+      <w:proofErr w:type="spellEnd"/>
+    </w:p>
+    <w:p/>
+    <w:p>
+      <w:r>
+        <w:rPr>
+          <w:noProof/>
+        </w:rPr>
+        <w:drawing>
+          <wp:inline distT="0" distB="0" distL="0" distR="0" wp14:anchorId="579B238F" wp14:editId="75B00B4C">
+            <wp:extent cx="4404360" cy="3848100"/>
+            <wp:effectExtent l="0" t="0" r="0" b="0"/>
+            <wp:docPr id="4" name="Picture 4"/>
+            <wp:cNvGraphicFramePr>
+              <a:graphicFrameLocks xmlns:a="http://schemas.openxmlformats.org/drawingml/2006/main" noChangeAspect="1"/>
+            </wp:cNvGraphicFramePr>
+            <a:graphic xmlns:a="http://schemas.openxmlformats.org/drawingml/2006/main">
+              <a:graphicData uri="http://schemas.openxmlformats.org/drawingml/2006/picture">
+                <pic:pic xmlns:pic="http://schemas.openxmlformats.org/drawingml/2006/picture">
+                  <pic:nvPicPr>
+                    <pic:cNvPr id="0" name="Picture 13"/>
+                    <pic:cNvPicPr>
+                      <a:picLocks noChangeAspect="1" noChangeArrowheads="1"/>
+                    </pic:cNvPicPr>
+                  </pic:nvPicPr>
+                  <pic:blipFill>
+                    <a:blip r:embed="rId10" cstate="print">
+                      <a:extLst>
+                        <a:ext uri="{28A0092B-C50C-407E-A947-70E740481C1C}">
+                          <a14:useLocalDpi xmlns:a14="http://schemas.microsoft.com/office/drawing/2010/main" val="0"/>
+                        </a:ext>
+                      </a:extLst>
+                    </a:blip>
+                    <a:srcRect/>
+                    <a:stretch>
+                      <a:fillRect/>
+                    </a:stretch>
+                  </pic:blipFill>
+                  <pic:spPr bwMode="auto">
+                    <a:xfrm>
+                      <a:off x="0" y="0"/>
+                      <a:ext cx="4404360" cy="3848100"/>
+                    </a:xfrm>
+                    <a:prstGeom prst="rect">
+                      <a:avLst/>
+                    </a:prstGeom>
+                    <a:noFill/>
+                    <a:ln>
+                      <a:noFill/>
+                    </a:ln>
+                  </pic:spPr>
+                </pic:pic>
+              </a:graphicData>
+            </a:graphic>
+          </wp:inline>
+        </w:drawing>
+      </w:r>
+    </w:p>
+    <w:p>
+      <w:r>
+        <w:t>Activity</w:t>
+      </w:r>
+    </w:p>
+    <w:p>
+      <w:r>
+        <w:rPr>
+          <w:noProof/>
+        </w:rPr>
+        <w:drawing>
+          <wp:inline distT="0" distB="0" distL="0" distR="0" wp14:anchorId="7DAE6774" wp14:editId="26C3CF4B">
+            <wp:extent cx="4686300" cy="2948940"/>
+            <wp:effectExtent l="0" t="0" r="0" b="0"/>
+            <wp:docPr id="32" name="Picture 32"/>
+            <wp:cNvGraphicFramePr>
+              <a:graphicFrameLocks xmlns:a="http://schemas.openxmlformats.org/drawingml/2006/main" noChangeAspect="1"/>
+            </wp:cNvGraphicFramePr>
+            <a:graphic xmlns:a="http://schemas.openxmlformats.org/drawingml/2006/main">
+              <a:graphicData uri="http://schemas.openxmlformats.org/drawingml/2006/picture">
+                <pic:pic xmlns:pic="http://schemas.openxmlformats.org/drawingml/2006/picture">
+                  <pic:nvPicPr>
+                    <pic:cNvPr id="0" name="Picture 111"/>
+                    <pic:cNvPicPr>
+                      <a:picLocks noChangeAspect="1" noChangeArrowheads="1"/>
+                    </pic:cNvPicPr>
+                  </pic:nvPicPr>
+                  <pic:blipFill>
+                    <a:blip r:embed="rId11" cstate="print">
+                      <a:extLst>
+                        <a:ext uri="{28A0092B-C50C-407E-A947-70E740481C1C}">
+                          <a14:useLocalDpi xmlns:a14="http://schemas.microsoft.com/office/drawing/2010/main" val="0"/>
+                        </a:ext>
+                      </a:extLst>
+                    </a:blip>
+                    <a:srcRect/>
+                    <a:stretch>
+                      <a:fillRect/>
+                    </a:stretch>
+                  </pic:blipFill>
+                  <pic:spPr bwMode="auto">
+                    <a:xfrm>
+                      <a:off x="0" y="0"/>
+                      <a:ext cx="4686300" cy="2948940"/>
+                    </a:xfrm>
+                    <a:prstGeom prst="rect">
+                      <a:avLst/>
+                    </a:prstGeom>
+                    <a:noFill/>
+                    <a:ln>
+                      <a:noFill/>
+                    </a:ln>
+                  </pic:spPr>
+                </pic:pic>
+              </a:graphicData>
+            </a:graphic>
+          </wp:inline>
+        </w:drawing>
+      </w:r>
+    </w:p>
+    <w:p>
+      <w:r>
+        <w:lastRenderedPageBreak/>
+        <w:t>Sequence</w:t>
+      </w:r>
+    </w:p>
+    <w:p/>
+    <w:p>
+      <w:r>
+        <w:rPr>
+          <w:noProof/>
+        </w:rPr>
+        <w:drawing>
+          <wp:inline distT="0" distB="0" distL="0" distR="0" wp14:anchorId="40F4375A" wp14:editId="73FC5FFE">
+            <wp:extent cx="4335780" cy="3124200"/>
+            <wp:effectExtent l="0" t="0" r="0" b="0"/>
+            <wp:docPr id="34" name="Picture 34"/>
+            <wp:cNvGraphicFramePr>
+              <a:graphicFrameLocks xmlns:a="http://schemas.openxmlformats.org/drawingml/2006/main" noChangeAspect="1"/>
+            </wp:cNvGraphicFramePr>
+            <a:graphic xmlns:a="http://schemas.openxmlformats.org/drawingml/2006/main">
+              <a:graphicData uri="http://schemas.openxmlformats.org/drawingml/2006/picture">
+                <pic:pic xmlns:pic="http://schemas.openxmlformats.org/drawingml/2006/picture">
+                  <pic:nvPicPr>
+                    <pic:cNvPr id="0" name="Picture 118"/>
+                    <pic:cNvPicPr>
+                      <a:picLocks noChangeAspect="1" noChangeArrowheads="1"/>
+                    </pic:cNvPicPr>
+                  </pic:nvPicPr>
+                  <pic:blipFill rotWithShape="1">
+                    <a:blip r:embed="rId12" cstate="print">
+                      <a:extLst>
+                        <a:ext uri="{28A0092B-C50C-407E-A947-70E740481C1C}">
+                          <a14:useLocalDpi xmlns:a14="http://schemas.microsoft.com/office/drawing/2010/main" val="0"/>
+                        </a:ext>
+                      </a:extLst>
+                    </a:blip>
+                    <a:srcRect r="-176" b="14046"/>
+                    <a:stretch/>
+                  </pic:blipFill>
+                  <pic:spPr bwMode="auto">
+                    <a:xfrm>
+                      <a:off x="0" y="0"/>
+                      <a:ext cx="4335780" cy="3124200"/>
+                    </a:xfrm>
+                    <a:prstGeom prst="rect">
+                      <a:avLst/>
+                    </a:prstGeom>
+                    <a:noFill/>
+                    <a:ln>
+                      <a:noFill/>
+                    </a:ln>
+                    <a:extLst>
+                      <a:ext uri="{53640926-AAD7-44D8-BBD7-CCE9431645EC}">
+                        <a14:shadowObscured xmlns:a14="http://schemas.microsoft.com/office/drawing/2010/main"/>
+                      </a:ext>
+                    </a:extLst>
+                  </pic:spPr>
+                </pic:pic>
+              </a:graphicData>
+            </a:graphic>
+          </wp:inline>
+        </w:drawing>
+      </w:r>
+    </w:p>
+    <w:p/>
+    <w:p>
+      <w:r>
+        <w:t>Uc3:</w:t>
+      </w:r>
+      <w:r>
+        <w:t xml:space="preserve"> </w:t>
+      </w:r>
+      <w:proofErr w:type="spellStart"/>
+      <w:r>
+        <w:t>Đặt</w:t>
+      </w:r>
+      <w:proofErr w:type="spellEnd"/>
+      <w:r>
+        <w:t xml:space="preserve"> </w:t>
+      </w:r>
+      <w:proofErr w:type="spellStart"/>
+      <w:r>
+        <w:t>cuộc</w:t>
+      </w:r>
+      <w:proofErr w:type="spellEnd"/>
+      <w:r>
+        <w:t xml:space="preserve"> </w:t>
+      </w:r>
+      <w:proofErr w:type="spellStart"/>
+      <w:r>
+        <w:t>hẹn</w:t>
+      </w:r>
+      <w:proofErr w:type="spellEnd"/>
+      <w:r>
+        <w:t xml:space="preserve"> </w:t>
+      </w:r>
+      <w:proofErr w:type="spellStart"/>
+      <w:r>
+        <w:t>khám</w:t>
+      </w:r>
+      <w:proofErr w:type="spellEnd"/>
+      <w:r>
+        <w:t xml:space="preserve"> </w:t>
+      </w:r>
+      <w:proofErr w:type="spellStart"/>
+      <w:r>
+        <w:t>sức</w:t>
+      </w:r>
+      <w:proofErr w:type="spellEnd"/>
+      <w:r>
+        <w:t xml:space="preserve"> </w:t>
+      </w:r>
+      <w:proofErr w:type="spellStart"/>
+      <w:r>
+        <w:t>khỏe</w:t>
+      </w:r>
+      <w:proofErr w:type="spellEnd"/>
+      <w:r>
+        <w:t xml:space="preserve"> </w:t>
+      </w:r>
+      <w:proofErr w:type="spellStart"/>
+      <w:r>
+        <w:t>định</w:t>
+      </w:r>
+      <w:proofErr w:type="spellEnd"/>
+      <w:r>
+        <w:t xml:space="preserve"> </w:t>
+      </w:r>
+      <w:proofErr w:type="spellStart"/>
+      <w:r>
+        <w:t>kỳ</w:t>
+      </w:r>
+      <w:proofErr w:type="spellEnd"/>
+      <w:r>
+        <w:t xml:space="preserve"> </w:t>
+      </w:r>
+      <w:proofErr w:type="spellStart"/>
+      <w:r>
+        <w:t>theo</w:t>
+      </w:r>
+      <w:proofErr w:type="spellEnd"/>
+      <w:r>
+        <w:t xml:space="preserve"> </w:t>
+      </w:r>
+      <w:proofErr w:type="spellStart"/>
+      <w:r>
+        <w:t>quý</w:t>
+      </w:r>
+      <w:proofErr w:type="spellEnd"/>
+    </w:p>
+    <w:p/>
+    <w:p>
+      <w:r>
+        <w:rPr>
+          <w:noProof/>
+        </w:rPr>
+        <w:drawing>
+          <wp:inline distT="0" distB="0" distL="0" distR="0" wp14:anchorId="33FB8D7C" wp14:editId="546F8B6A">
+            <wp:extent cx="4084320" cy="3070860"/>
+            <wp:effectExtent l="0" t="0" r="0" b="0"/>
+            <wp:docPr id="10" name="Picture 10"/>
+            <wp:cNvGraphicFramePr>
+              <a:graphicFrameLocks xmlns:a="http://schemas.openxmlformats.org/drawingml/2006/main" noChangeAspect="1"/>
+            </wp:cNvGraphicFramePr>
+            <a:graphic xmlns:a="http://schemas.openxmlformats.org/drawingml/2006/main">
+              <a:graphicData uri="http://schemas.openxmlformats.org/drawingml/2006/picture">
+                <pic:pic xmlns:pic="http://schemas.openxmlformats.org/drawingml/2006/picture">
+                  <pic:nvPicPr>
+                    <pic:cNvPr id="0" name="Picture 34"/>
+                    <pic:cNvPicPr>
+                      <a:picLocks noChangeAspect="1" noChangeArrowheads="1"/>
+                    </pic:cNvPicPr>
+                  </pic:nvPicPr>
+                  <pic:blipFill>
+                    <a:blip r:embed="rId13" cstate="print">
+                      <a:extLst>
+                        <a:ext uri="{28A0092B-C50C-407E-A947-70E740481C1C}">
+                          <a14:useLocalDpi xmlns:a14="http://schemas.microsoft.com/office/drawing/2010/main" val="0"/>
+                        </a:ext>
+                      </a:extLst>
+                    </a:blip>
+                    <a:srcRect/>
+                    <a:stretch>
+                      <a:fillRect/>
+                    </a:stretch>
+                  </pic:blipFill>
+                  <pic:spPr bwMode="auto">
+                    <a:xfrm>
+                      <a:off x="0" y="0"/>
+                      <a:ext cx="4084320" cy="3070860"/>
+                    </a:xfrm>
+                    <a:prstGeom prst="rect">
+                      <a:avLst/>
+                    </a:prstGeom>
+                    <a:noFill/>
+                    <a:ln>
+                      <a:noFill/>
+                    </a:ln>
+                  </pic:spPr>
+                </pic:pic>
+              </a:graphicData>
+            </a:graphic>
+          </wp:inline>
+        </w:drawing>
+      </w:r>
+    </w:p>
+    <w:p/>
+    <w:p>
+      <w:r>
+        <w:t xml:space="preserve">Uc4: </w:t>
+      </w:r>
+      <w:r>
+        <w:t xml:space="preserve">Tra </w:t>
+      </w:r>
+      <w:proofErr w:type="spellStart"/>
+      <w:r>
+        <w:t>cứu</w:t>
+      </w:r>
+      <w:proofErr w:type="spellEnd"/>
+      <w:r>
+        <w:t xml:space="preserve"> &amp; Xem </w:t>
+      </w:r>
+      <w:proofErr w:type="spellStart"/>
+      <w:r>
+        <w:t>lý</w:t>
+      </w:r>
+      <w:proofErr w:type="spellEnd"/>
+      <w:r>
+        <w:t xml:space="preserve"> </w:t>
+      </w:r>
+      <w:proofErr w:type="spellStart"/>
+      <w:r>
+        <w:t>lịch</w:t>
+      </w:r>
+      <w:proofErr w:type="spellEnd"/>
+      <w:r>
+        <w:t xml:space="preserve"> </w:t>
+      </w:r>
+      <w:proofErr w:type="spellStart"/>
+      <w:r>
+        <w:t>hồ</w:t>
+      </w:r>
+      <w:proofErr w:type="spellEnd"/>
+      <w:r>
+        <w:t xml:space="preserve"> </w:t>
+      </w:r>
+      <w:proofErr w:type="spellStart"/>
+      <w:r>
+        <w:t>sơ</w:t>
+      </w:r>
+      <w:proofErr w:type="spellEnd"/>
+      <w:r>
+        <w:t xml:space="preserve"> </w:t>
+      </w:r>
+      <w:proofErr w:type="spellStart"/>
+      <w:r>
+        <w:t>bệnh</w:t>
+      </w:r>
+      <w:proofErr w:type="spellEnd"/>
+      <w:r>
+        <w:t xml:space="preserve"> </w:t>
+      </w:r>
+      <w:proofErr w:type="spellStart"/>
+      <w:r>
+        <w:t>án</w:t>
+      </w:r>
+      <w:proofErr w:type="spellEnd"/>
+    </w:p>
+    <w:p>
+      <w:r>
+        <w:rPr>
+          <w:noProof/>
+        </w:rPr>
+        <w:drawing>
+          <wp:inline distT="0" distB="0" distL="0" distR="0" wp14:anchorId="56443248" wp14:editId="1149C6A8">
+            <wp:extent cx="3909060" cy="3101340"/>
+            <wp:effectExtent l="0" t="0" r="0" b="0"/>
+            <wp:docPr id="8" name="Picture 8"/>
+            <wp:cNvGraphicFramePr>
+              <a:graphicFrameLocks xmlns:a="http://schemas.openxmlformats.org/drawingml/2006/main" noChangeAspect="1"/>
+            </wp:cNvGraphicFramePr>
+            <a:graphic xmlns:a="http://schemas.openxmlformats.org/drawingml/2006/main">
+              <a:graphicData uri="http://schemas.openxmlformats.org/drawingml/2006/picture">
+                <pic:pic xmlns:pic="http://schemas.openxmlformats.org/drawingml/2006/picture">
+                  <pic:nvPicPr>
+                    <pic:cNvPr id="0" name="Picture 27"/>
+                    <pic:cNvPicPr>
+                      <a:picLocks noChangeAspect="1" noChangeArrowheads="1"/>
+                    </pic:cNvPicPr>
+                  </pic:nvPicPr>
+                  <pic:blipFill>
+                    <a:blip r:embed="rId14" cstate="print">
+                      <a:extLst>
+                        <a:ext uri="{28A0092B-C50C-407E-A947-70E740481C1C}">
+                          <a14:useLocalDpi xmlns:a14="http://schemas.microsoft.com/office/drawing/2010/main" val="0"/>
+                        </a:ext>
+                      </a:extLst>
+                    </a:blip>
+                    <a:srcRect/>
+                    <a:stretch>
+                      <a:fillRect/>
+                    </a:stretch>
+                  </pic:blipFill>
+                  <pic:spPr bwMode="auto">
+                    <a:xfrm>
+                      <a:off x="0" y="0"/>
+                      <a:ext cx="3909060" cy="3101340"/>
+                    </a:xfrm>
+                    <a:prstGeom prst="rect">
+                      <a:avLst/>
+                    </a:prstGeom>
+                    <a:noFill/>
+                    <a:ln>
+                      <a:noFill/>
+                    </a:ln>
+                  </pic:spPr>
+                </pic:pic>
+              </a:graphicData>
+            </a:graphic>
+          </wp:inline>
+        </w:drawing>
+      </w:r>
+    </w:p>
+    <w:p>
+      <w:r>
+        <w:t xml:space="preserve">Uc5: </w:t>
+      </w:r>
+      <w:proofErr w:type="spellStart"/>
+      <w:r>
+        <w:t>Khám</w:t>
+      </w:r>
+      <w:proofErr w:type="spellEnd"/>
+      <w:r>
+        <w:t xml:space="preserve"> </w:t>
+      </w:r>
+      <w:proofErr w:type="spellStart"/>
+      <w:r>
+        <w:t>bệnh</w:t>
+      </w:r>
+      <w:proofErr w:type="spellEnd"/>
+      <w:r>
+        <w:t xml:space="preserve"> &amp; </w:t>
+      </w:r>
+      <w:proofErr w:type="spellStart"/>
+      <w:r>
+        <w:t>Ghi</w:t>
+      </w:r>
+      <w:proofErr w:type="spellEnd"/>
+      <w:r>
+        <w:t xml:space="preserve"> </w:t>
+      </w:r>
+      <w:proofErr w:type="spellStart"/>
+      <w:r>
+        <w:t>nhận</w:t>
+      </w:r>
+      <w:proofErr w:type="spellEnd"/>
+      <w:r>
+        <w:t xml:space="preserve"> </w:t>
+      </w:r>
+      <w:proofErr w:type="spellStart"/>
+      <w:r>
+        <w:t>triệu</w:t>
+      </w:r>
+      <w:proofErr w:type="spellEnd"/>
+      <w:r>
+        <w:t xml:space="preserve"> </w:t>
+      </w:r>
+      <w:proofErr w:type="spellStart"/>
+      <w:r>
+        <w:t>chứng</w:t>
+      </w:r>
+      <w:proofErr w:type="spellEnd"/>
+    </w:p>
+    <w:p>
+      <w:r>
+        <w:rPr>
+          <w:noProof/>
+        </w:rPr>
+        <w:drawing>
+          <wp:inline distT="0" distB="0" distL="0" distR="0" wp14:anchorId="5656CDFB" wp14:editId="5B2903CD">
+            <wp:extent cx="3909060" cy="3200400"/>
+            <wp:effectExtent l="0" t="0" r="0" b="0"/>
+            <wp:docPr id="12" name="Picture 12"/>
+            <wp:cNvGraphicFramePr>
+              <a:graphicFrameLocks xmlns:a="http://schemas.openxmlformats.org/drawingml/2006/main" noChangeAspect="1"/>
+            </wp:cNvGraphicFramePr>
+            <a:graphic xmlns:a="http://schemas.openxmlformats.org/drawingml/2006/main">
+              <a:graphicData uri="http://schemas.openxmlformats.org/drawingml/2006/picture">
+                <pic:pic xmlns:pic="http://schemas.openxmlformats.org/drawingml/2006/picture">
+                  <pic:nvPicPr>
+                    <pic:cNvPr id="0" name="Picture 41"/>
+                    <pic:cNvPicPr>
+                      <a:picLocks noChangeAspect="1" noChangeArrowheads="1"/>
+                    </pic:cNvPicPr>
+                  </pic:nvPicPr>
+                  <pic:blipFill>
+                    <a:blip r:embed="rId15" cstate="print">
+                      <a:extLst>
+                        <a:ext uri="{28A0092B-C50C-407E-A947-70E740481C1C}">
+                          <a14:useLocalDpi xmlns:a14="http://schemas.microsoft.com/office/drawing/2010/main" val="0"/>
+                        </a:ext>
+                      </a:extLst>
+                    </a:blip>
+                    <a:srcRect/>
+                    <a:stretch>
+                      <a:fillRect/>
+                    </a:stretch>
+                  </pic:blipFill>
+                  <pic:spPr bwMode="auto">
+                    <a:xfrm>
+                      <a:off x="0" y="0"/>
+                      <a:ext cx="3909060" cy="3200400"/>
+                    </a:xfrm>
+                    <a:prstGeom prst="rect">
+                      <a:avLst/>
+                    </a:prstGeom>
+                    <a:noFill/>
+                    <a:ln>
+                      <a:noFill/>
+                    </a:ln>
+                  </pic:spPr>
+                </pic:pic>
+              </a:graphicData>
+            </a:graphic>
+          </wp:inline>
+        </w:drawing>
+      </w:r>
+    </w:p>
+    <w:p/>
+    <w:p>
+      <w:r>
+        <w:lastRenderedPageBreak/>
+        <w:t xml:space="preserve">Uc6: </w:t>
+      </w:r>
+      <w:proofErr w:type="spellStart"/>
+      <w:r>
+        <w:t>Chỉ</w:t>
+      </w:r>
+      <w:proofErr w:type="spellEnd"/>
+      <w:r>
+        <w:t xml:space="preserve"> </w:t>
+      </w:r>
+      <w:proofErr w:type="spellStart"/>
+      <w:r>
+        <w:t>định</w:t>
+      </w:r>
+      <w:proofErr w:type="spellEnd"/>
+      <w:r>
+        <w:t xml:space="preserve"> &amp; </w:t>
+      </w:r>
+      <w:proofErr w:type="spellStart"/>
+      <w:r>
+        <w:t>Trả</w:t>
+      </w:r>
+      <w:proofErr w:type="spellEnd"/>
+      <w:r>
+        <w:t xml:space="preserve"> </w:t>
+      </w:r>
+      <w:proofErr w:type="spellStart"/>
+      <w:r>
+        <w:t>kết</w:t>
+      </w:r>
+      <w:proofErr w:type="spellEnd"/>
+      <w:r>
+        <w:t xml:space="preserve"> </w:t>
+      </w:r>
+      <w:proofErr w:type="spellStart"/>
+      <w:r>
+        <w:t>quả</w:t>
+      </w:r>
+      <w:proofErr w:type="spellEnd"/>
+      <w:r>
+        <w:t xml:space="preserve"> </w:t>
+      </w:r>
+      <w:proofErr w:type="spellStart"/>
+      <w:r>
+        <w:t>xét</w:t>
+      </w:r>
+      <w:proofErr w:type="spellEnd"/>
+      <w:r>
+        <w:t xml:space="preserve"> </w:t>
+      </w:r>
+      <w:proofErr w:type="spellStart"/>
+      <w:r>
+        <w:t>nghiệm</w:t>
+      </w:r>
+      <w:proofErr w:type="spellEnd"/>
+    </w:p>
+    <w:p>
+      <w:r>
+        <w:rPr>
+          <w:noProof/>
+        </w:rPr>
+        <w:drawing>
+          <wp:inline distT="0" distB="0" distL="0" distR="0" wp14:anchorId="4F83C5B5" wp14:editId="0D44A2B9">
+            <wp:extent cx="4084320" cy="3581400"/>
+            <wp:effectExtent l="0" t="0" r="0" b="0"/>
+            <wp:docPr id="20" name="Picture 20"/>
+            <wp:cNvGraphicFramePr>
+              <a:graphicFrameLocks xmlns:a="http://schemas.openxmlformats.org/drawingml/2006/main" noChangeAspect="1"/>
+            </wp:cNvGraphicFramePr>
+            <a:graphic xmlns:a="http://schemas.openxmlformats.org/drawingml/2006/main">
+              <a:graphicData uri="http://schemas.openxmlformats.org/drawingml/2006/picture">
+                <pic:pic xmlns:pic="http://schemas.openxmlformats.org/drawingml/2006/picture">
+                  <pic:nvPicPr>
+                    <pic:cNvPr id="0" name="Picture 69"/>
+                    <pic:cNvPicPr>
+                      <a:picLocks noChangeAspect="1" noChangeArrowheads="1"/>
+                    </pic:cNvPicPr>
+                  </pic:nvPicPr>
+                  <pic:blipFill>
+                    <a:blip r:embed="rId16" cstate="print">
+                      <a:extLst>
+                        <a:ext uri="{28A0092B-C50C-407E-A947-70E740481C1C}">
+                          <a14:useLocalDpi xmlns:a14="http://schemas.microsoft.com/office/drawing/2010/main" val="0"/>
+                        </a:ext>
+                      </a:extLst>
+                    </a:blip>
+                    <a:srcRect/>
+                    <a:stretch>
+                      <a:fillRect/>
+                    </a:stretch>
+                  </pic:blipFill>
+                  <pic:spPr bwMode="auto">
+                    <a:xfrm>
+                      <a:off x="0" y="0"/>
+                      <a:ext cx="4084320" cy="3581400"/>
+                    </a:xfrm>
+                    <a:prstGeom prst="rect">
+                      <a:avLst/>
+                    </a:prstGeom>
+                    <a:noFill/>
+                    <a:ln>
+                      <a:noFill/>
+                    </a:ln>
+                  </pic:spPr>
+                </pic:pic>
+              </a:graphicData>
+            </a:graphic>
+          </wp:inline>
+        </w:drawing>
+      </w:r>
+    </w:p>
+    <w:p>
+      <w:r>
+        <w:t>Activity</w:t>
+      </w:r>
+    </w:p>
+    <w:p>
+      <w:r>
+        <w:rPr>
+          <w:noProof/>
+        </w:rPr>
+        <w:lastRenderedPageBreak/>
+        <w:drawing>
+          <wp:inline distT="0" distB="0" distL="0" distR="0" wp14:anchorId="1D235140" wp14:editId="6EF0C702">
+            <wp:extent cx="5715000" cy="4770120"/>
+            <wp:effectExtent l="0" t="0" r="0" b="0"/>
+            <wp:docPr id="42" name="Picture 42"/>
+            <wp:cNvGraphicFramePr>
+              <a:graphicFrameLocks xmlns:a="http://schemas.openxmlformats.org/drawingml/2006/main" noChangeAspect="1"/>
+            </wp:cNvGraphicFramePr>
+            <a:graphic xmlns:a="http://schemas.openxmlformats.org/drawingml/2006/main">
+              <a:graphicData uri="http://schemas.openxmlformats.org/drawingml/2006/picture">
+                <pic:pic xmlns:pic="http://schemas.openxmlformats.org/drawingml/2006/picture">
+                  <pic:nvPicPr>
+                    <pic:cNvPr id="0" name="Picture 146"/>
+                    <pic:cNvPicPr>
+                      <a:picLocks noChangeAspect="1" noChangeArrowheads="1"/>
+                    </pic:cNvPicPr>
+                  </pic:nvPicPr>
+                  <pic:blipFill>
+                    <a:blip r:embed="rId17" cstate="print">
+                      <a:extLst>
+                        <a:ext uri="{28A0092B-C50C-407E-A947-70E740481C1C}">
+                          <a14:useLocalDpi xmlns:a14="http://schemas.microsoft.com/office/drawing/2010/main" val="0"/>
+                        </a:ext>
+                      </a:extLst>
+                    </a:blip>
+                    <a:srcRect/>
+                    <a:stretch>
+                      <a:fillRect/>
+                    </a:stretch>
+                  </pic:blipFill>
+                  <pic:spPr bwMode="auto">
+                    <a:xfrm>
+                      <a:off x="0" y="0"/>
+                      <a:ext cx="5715000" cy="4770120"/>
+                    </a:xfrm>
+                    <a:prstGeom prst="rect">
+                      <a:avLst/>
+                    </a:prstGeom>
+                    <a:noFill/>
+                    <a:ln>
+                      <a:noFill/>
+                    </a:ln>
+                  </pic:spPr>
+                </pic:pic>
+              </a:graphicData>
+            </a:graphic>
+          </wp:inline>
+        </w:drawing>
+      </w:r>
+    </w:p>
+    <w:p/>
+    <w:p>
+      <w:r>
+        <w:t xml:space="preserve">Uc7: </w:t>
+      </w:r>
+      <w:proofErr w:type="spellStart"/>
+      <w:r>
+        <w:t>Lập</w:t>
+      </w:r>
+      <w:proofErr w:type="spellEnd"/>
+      <w:r>
+        <w:t xml:space="preserve"> toa </w:t>
+      </w:r>
+      <w:proofErr w:type="spellStart"/>
+      <w:r>
+        <w:t>thuốc</w:t>
+      </w:r>
+      <w:proofErr w:type="spellEnd"/>
+    </w:p>
+    <w:p/>
+    <w:p>
+      <w:r>
+        <w:rPr>
+          <w:noProof/>
+        </w:rPr>
+        <w:lastRenderedPageBreak/>
+        <w:drawing>
+          <wp:inline distT="0" distB="0" distL="0" distR="0" wp14:anchorId="260F91DD" wp14:editId="3E5B81C2">
+            <wp:extent cx="4183380" cy="3063240"/>
+            <wp:effectExtent l="0" t="0" r="0" b="0"/>
+            <wp:docPr id="22" name="Picture 22"/>
+            <wp:cNvGraphicFramePr>
+              <a:graphicFrameLocks xmlns:a="http://schemas.openxmlformats.org/drawingml/2006/main" noChangeAspect="1"/>
+            </wp:cNvGraphicFramePr>
+            <a:graphic xmlns:a="http://schemas.openxmlformats.org/drawingml/2006/main">
+              <a:graphicData uri="http://schemas.openxmlformats.org/drawingml/2006/picture">
+                <pic:pic xmlns:pic="http://schemas.openxmlformats.org/drawingml/2006/picture">
+                  <pic:nvPicPr>
+                    <pic:cNvPr id="0" name="Picture 76"/>
+                    <pic:cNvPicPr>
+                      <a:picLocks noChangeAspect="1" noChangeArrowheads="1"/>
+                    </pic:cNvPicPr>
+                  </pic:nvPicPr>
+                  <pic:blipFill>
+                    <a:blip r:embed="rId18" cstate="print">
+                      <a:extLst>
+                        <a:ext uri="{28A0092B-C50C-407E-A947-70E740481C1C}">
+                          <a14:useLocalDpi xmlns:a14="http://schemas.microsoft.com/office/drawing/2010/main" val="0"/>
+                        </a:ext>
+                      </a:extLst>
+                    </a:blip>
+                    <a:srcRect/>
+                    <a:stretch>
+                      <a:fillRect/>
+                    </a:stretch>
+                  </pic:blipFill>
+                  <pic:spPr bwMode="auto">
+                    <a:xfrm>
+                      <a:off x="0" y="0"/>
+                      <a:ext cx="4183380" cy="3063240"/>
+                    </a:xfrm>
+                    <a:prstGeom prst="rect">
+                      <a:avLst/>
+                    </a:prstGeom>
+                    <a:noFill/>
+                    <a:ln>
+                      <a:noFill/>
+                    </a:ln>
+                  </pic:spPr>
+                </pic:pic>
+              </a:graphicData>
+            </a:graphic>
+          </wp:inline>
+        </w:drawing>
+      </w:r>
+    </w:p>
+    <w:p>
+      <w:r>
+        <w:t>Activity</w:t>
+      </w:r>
+    </w:p>
+    <w:p>
+      <w:r>
+        <w:rPr>
+          <w:noProof/>
+        </w:rPr>
+        <w:drawing>
+          <wp:inline distT="0" distB="0" distL="0" distR="0" wp14:anchorId="578DCB56" wp14:editId="75BE969A">
+            <wp:extent cx="4297680" cy="3025140"/>
+            <wp:effectExtent l="0" t="0" r="0" b="0"/>
+            <wp:docPr id="36" name="Picture 36"/>
+            <wp:cNvGraphicFramePr>
+              <a:graphicFrameLocks xmlns:a="http://schemas.openxmlformats.org/drawingml/2006/main" noChangeAspect="1"/>
+            </wp:cNvGraphicFramePr>
+            <a:graphic xmlns:a="http://schemas.openxmlformats.org/drawingml/2006/main">
+              <a:graphicData uri="http://schemas.openxmlformats.org/drawingml/2006/picture">
+                <pic:pic xmlns:pic="http://schemas.openxmlformats.org/drawingml/2006/picture">
+                  <pic:nvPicPr>
+                    <pic:cNvPr id="0" name="Picture 125"/>
+                    <pic:cNvPicPr>
+                      <a:picLocks noChangeAspect="1" noChangeArrowheads="1"/>
+                    </pic:cNvPicPr>
+                  </pic:nvPicPr>
+                  <pic:blipFill>
+                    <a:blip r:embed="rId19" cstate="print">
+                      <a:extLst>
+                        <a:ext uri="{28A0092B-C50C-407E-A947-70E740481C1C}">
+                          <a14:useLocalDpi xmlns:a14="http://schemas.microsoft.com/office/drawing/2010/main" val="0"/>
+                        </a:ext>
+                      </a:extLst>
+                    </a:blip>
+                    <a:srcRect/>
+                    <a:stretch>
+                      <a:fillRect/>
+                    </a:stretch>
+                  </pic:blipFill>
+                  <pic:spPr bwMode="auto">
+                    <a:xfrm>
+                      <a:off x="0" y="0"/>
+                      <a:ext cx="4297680" cy="3025140"/>
+                    </a:xfrm>
+                    <a:prstGeom prst="rect">
+                      <a:avLst/>
+                    </a:prstGeom>
+                    <a:noFill/>
+                    <a:ln>
+                      <a:noFill/>
+                    </a:ln>
+                  </pic:spPr>
+                </pic:pic>
+              </a:graphicData>
+            </a:graphic>
+          </wp:inline>
+        </w:drawing>
+      </w:r>
+    </w:p>
+    <w:p>
+      <w:r>
+        <w:t>Sequence</w:t>
+      </w:r>
+    </w:p>
+    <w:p/>
+    <w:p>
+      <w:r>
+        <w:rPr>
+          <w:noProof/>
+        </w:rPr>
+        <w:lastRenderedPageBreak/>
+        <w:drawing>
+          <wp:inline distT="0" distB="0" distL="0" distR="0" wp14:anchorId="2BA49585" wp14:editId="6408E7A8">
+            <wp:extent cx="5173980" cy="4206240"/>
+            <wp:effectExtent l="0" t="0" r="7620" b="0"/>
+            <wp:docPr id="40" name="Picture 40"/>
+            <wp:cNvGraphicFramePr>
+              <a:graphicFrameLocks xmlns:a="http://schemas.openxmlformats.org/drawingml/2006/main" noChangeAspect="1"/>
+            </wp:cNvGraphicFramePr>
+            <a:graphic xmlns:a="http://schemas.openxmlformats.org/drawingml/2006/main">
+              <a:graphicData uri="http://schemas.openxmlformats.org/drawingml/2006/picture">
+                <pic:pic xmlns:pic="http://schemas.openxmlformats.org/drawingml/2006/picture">
+                  <pic:nvPicPr>
+                    <pic:cNvPr id="0" name="Picture 139"/>
+                    <pic:cNvPicPr>
+                      <a:picLocks noChangeAspect="1" noChangeArrowheads="1"/>
+                    </pic:cNvPicPr>
+                  </pic:nvPicPr>
+                  <pic:blipFill>
+                    <a:blip r:embed="rId20" cstate="print">
+                      <a:extLst>
+                        <a:ext uri="{28A0092B-C50C-407E-A947-70E740481C1C}">
+                          <a14:useLocalDpi xmlns:a14="http://schemas.microsoft.com/office/drawing/2010/main" val="0"/>
+                        </a:ext>
+                      </a:extLst>
+                    </a:blip>
+                    <a:srcRect/>
+                    <a:stretch>
+                      <a:fillRect/>
+                    </a:stretch>
+                  </pic:blipFill>
+                  <pic:spPr bwMode="auto">
+                    <a:xfrm>
+                      <a:off x="0" y="0"/>
+                      <a:ext cx="5173980" cy="4206240"/>
+                    </a:xfrm>
+                    <a:prstGeom prst="rect">
+                      <a:avLst/>
+                    </a:prstGeom>
+                    <a:noFill/>
+                    <a:ln>
+                      <a:noFill/>
+                    </a:ln>
+                  </pic:spPr>
+                </pic:pic>
+              </a:graphicData>
+            </a:graphic>
+          </wp:inline>
+        </w:drawing>
+      </w:r>
+    </w:p>
+    <w:p/>
+    <w:p>
+      <w:r>
+        <w:t xml:space="preserve">Uc8: </w:t>
+      </w:r>
+      <w:r>
+        <w:t xml:space="preserve">Thanh </w:t>
+      </w:r>
+      <w:proofErr w:type="spellStart"/>
+      <w:r>
+        <w:t>toán</w:t>
+      </w:r>
+      <w:proofErr w:type="spellEnd"/>
+      <w:r>
+        <w:t xml:space="preserve"> </w:t>
+      </w:r>
+      <w:proofErr w:type="spellStart"/>
+      <w:r>
+        <w:t>viện</w:t>
+      </w:r>
+      <w:proofErr w:type="spellEnd"/>
+      <w:r>
+        <w:t xml:space="preserve"> </w:t>
+      </w:r>
+      <w:proofErr w:type="spellStart"/>
+      <w:r>
+        <w:t>phí</w:t>
+      </w:r>
+      <w:proofErr w:type="spellEnd"/>
+      <w:r>
+        <w:t xml:space="preserve"> &amp; </w:t>
+      </w:r>
+      <w:proofErr w:type="spellStart"/>
+      <w:r>
+        <w:t>Làm</w:t>
+      </w:r>
+      <w:proofErr w:type="spellEnd"/>
+      <w:r>
+        <w:t xml:space="preserve"> </w:t>
+      </w:r>
+      <w:proofErr w:type="spellStart"/>
+      <w:r>
+        <w:t>thủ</w:t>
+      </w:r>
+      <w:proofErr w:type="spellEnd"/>
+      <w:r>
+        <w:t xml:space="preserve"> </w:t>
+      </w:r>
+      <w:proofErr w:type="spellStart"/>
+      <w:r>
+        <w:t>tục</w:t>
+      </w:r>
+      <w:proofErr w:type="spellEnd"/>
+      <w:r>
+        <w:t xml:space="preserve"> </w:t>
+      </w:r>
+      <w:proofErr w:type="spellStart"/>
+      <w:r>
+        <w:t>xuất</w:t>
+      </w:r>
+      <w:proofErr w:type="spellEnd"/>
+      <w:r>
+        <w:t xml:space="preserve"> </w:t>
+      </w:r>
+      <w:proofErr w:type="spellStart"/>
+      <w:r>
+        <w:t>viện</w:t>
+      </w:r>
+      <w:proofErr w:type="spellEnd"/>
+    </w:p>
+    <w:p>
+      <w:r>
+        <w:rPr>
+          <w:noProof/>
+        </w:rPr>
+        <w:drawing>
+          <wp:inline distT="0" distB="0" distL="0" distR="0" wp14:anchorId="44ABF7CA" wp14:editId="144DDF78">
+            <wp:extent cx="4259580" cy="2842260"/>
+            <wp:effectExtent l="0" t="0" r="0" b="0"/>
+            <wp:docPr id="24" name="Picture 24"/>
+            <wp:cNvGraphicFramePr>
+              <a:graphicFrameLocks xmlns:a="http://schemas.openxmlformats.org/drawingml/2006/main" noChangeAspect="1"/>
+            </wp:cNvGraphicFramePr>
+            <a:graphic xmlns:a="http://schemas.openxmlformats.org/drawingml/2006/main">
+              <a:graphicData uri="http://schemas.openxmlformats.org/drawingml/2006/picture">
+                <pic:pic xmlns:pic="http://schemas.openxmlformats.org/drawingml/2006/picture">
+                  <pic:nvPicPr>
+                    <pic:cNvPr id="0" name="Picture 83"/>
+                    <pic:cNvPicPr>
+                      <a:picLocks noChangeAspect="1" noChangeArrowheads="1"/>
+                    </pic:cNvPicPr>
+                  </pic:nvPicPr>
+                  <pic:blipFill>
+                    <a:blip r:embed="rId21" cstate="print">
+                      <a:extLst>
+                        <a:ext uri="{28A0092B-C50C-407E-A947-70E740481C1C}">
+                          <a14:useLocalDpi xmlns:a14="http://schemas.microsoft.com/office/drawing/2010/main" val="0"/>
+                        </a:ext>
+                      </a:extLst>
+                    </a:blip>
+                    <a:srcRect/>
+                    <a:stretch>
+                      <a:fillRect/>
+                    </a:stretch>
+                  </pic:blipFill>
+                  <pic:spPr bwMode="auto">
+                    <a:xfrm>
+                      <a:off x="0" y="0"/>
+                      <a:ext cx="4259580" cy="2842260"/>
+                    </a:xfrm>
+                    <a:prstGeom prst="rect">
+                      <a:avLst/>
+                    </a:prstGeom>
+                    <a:noFill/>
+                    <a:ln>
+                      <a:noFill/>
+                    </a:ln>
+                  </pic:spPr>
+                </pic:pic>
+              </a:graphicData>
+            </a:graphic>
+          </wp:inline>
+        </w:drawing>
+      </w:r>
+    </w:p>
+    <w:p/>
+    <w:p>
+      <w:pPr>
+        <w:rPr>
+          <w:b/>
+          <w:bCs/>
+        </w:rPr>
+      </w:pPr>
+      <w:r>
+        <w:t xml:space="preserve">Uc9: </w:t>
+      </w:r>
+      <w:proofErr w:type="spellStart"/>
+      <w:r>
+        <w:rPr>
+          <w:b/>
+          <w:bCs/>
+        </w:rPr>
+        <w:t>Ghi</w:t>
+      </w:r>
+      <w:proofErr w:type="spellEnd"/>
+      <w:r>
+        <w:rPr>
+          <w:b/>
+          <w:bCs/>
+        </w:rPr>
+        <w:t xml:space="preserve"> </w:t>
+      </w:r>
+      <w:proofErr w:type="spellStart"/>
+      <w:r>
+        <w:rPr>
+          <w:b/>
+          <w:bCs/>
+        </w:rPr>
+        <w:t>nhận</w:t>
+      </w:r>
+      <w:proofErr w:type="spellEnd"/>
+      <w:r>
+        <w:rPr>
+          <w:b/>
+          <w:bCs/>
+        </w:rPr>
+        <w:t xml:space="preserve"> </w:t>
+      </w:r>
+      <w:proofErr w:type="spellStart"/>
+      <w:r>
+        <w:rPr>
+          <w:b/>
+          <w:bCs/>
+        </w:rPr>
+        <w:t>diễn</w:t>
+      </w:r>
+      <w:proofErr w:type="spellEnd"/>
+      <w:r>
+        <w:rPr>
+          <w:b/>
+          <w:bCs/>
+        </w:rPr>
+        <w:t xml:space="preserve"> </w:t>
+      </w:r>
+      <w:proofErr w:type="spellStart"/>
+      <w:r>
+        <w:rPr>
+          <w:b/>
+          <w:bCs/>
+        </w:rPr>
+        <w:t>biến</w:t>
+      </w:r>
+      <w:proofErr w:type="spellEnd"/>
+      <w:r>
+        <w:rPr>
+          <w:b/>
+          <w:bCs/>
+        </w:rPr>
+        <w:t xml:space="preserve"> </w:t>
+      </w:r>
+      <w:proofErr w:type="spellStart"/>
+      <w:r>
+        <w:rPr>
+          <w:b/>
+          <w:bCs/>
+        </w:rPr>
+        <w:t>điều</w:t>
+      </w:r>
+      <w:proofErr w:type="spellEnd"/>
+      <w:r>
+        <w:rPr>
+          <w:b/>
+          <w:bCs/>
+        </w:rPr>
+        <w:t xml:space="preserve"> </w:t>
+      </w:r>
+      <w:proofErr w:type="spellStart"/>
+      <w:r>
+        <w:rPr>
+          <w:b/>
+          <w:bCs/>
+        </w:rPr>
+        <w:t>trị</w:t>
+      </w:r>
+      <w:proofErr w:type="spellEnd"/>
+      <w:r>
+        <w:rPr>
+          <w:b/>
+          <w:bCs/>
+        </w:rPr>
+        <w:t xml:space="preserve"> &amp; </w:t>
+      </w:r>
+      <w:proofErr w:type="spellStart"/>
+      <w:r>
+        <w:rPr>
+          <w:b/>
+          <w:bCs/>
+        </w:rPr>
+        <w:t>Phản</w:t>
+      </w:r>
+      <w:proofErr w:type="spellEnd"/>
+      <w:r>
+        <w:rPr>
+          <w:b/>
+          <w:bCs/>
+        </w:rPr>
+        <w:t xml:space="preserve"> </w:t>
+      </w:r>
+      <w:proofErr w:type="spellStart"/>
+      <w:r>
+        <w:rPr>
+          <w:b/>
+          <w:bCs/>
+        </w:rPr>
+        <w:t>ứng</w:t>
+      </w:r>
+      <w:proofErr w:type="spellEnd"/>
+      <w:r>
+        <w:rPr>
+          <w:b/>
+          <w:bCs/>
+        </w:rPr>
+        <w:t xml:space="preserve"> </w:t>
+      </w:r>
+      <w:proofErr w:type="spellStart"/>
+      <w:r>
+        <w:rPr>
+          <w:b/>
+          <w:bCs/>
+        </w:rPr>
+        <w:t>phụ</w:t>
+      </w:r>
+      <w:proofErr w:type="spellEnd"/>
+      <w:r>
+        <w:rPr>
+          <w:b/>
+          <w:bCs/>
+        </w:rPr>
+        <w:t xml:space="preserve"> </w:t>
+      </w:r>
+      <w:proofErr w:type="spellStart"/>
+      <w:r>
+        <w:rPr>
+          <w:b/>
+          <w:bCs/>
+        </w:rPr>
+        <w:t>hậu</w:t>
+      </w:r>
+      <w:proofErr w:type="spellEnd"/>
+      <w:r>
+        <w:rPr>
+          <w:b/>
+          <w:bCs/>
+        </w:rPr>
+        <w:t xml:space="preserve"> </w:t>
+      </w:r>
+      <w:proofErr w:type="spellStart"/>
+      <w:r>
+        <w:rPr>
+          <w:b/>
+          <w:bCs/>
+        </w:rPr>
+        <w:t>xuất</w:t>
+      </w:r>
+      <w:proofErr w:type="spellEnd"/>
+      <w:r>
+        <w:rPr>
+          <w:b/>
+          <w:bCs/>
+        </w:rPr>
+        <w:t xml:space="preserve"> </w:t>
+      </w:r>
+      <w:proofErr w:type="spellStart"/>
+      <w:r>
+        <w:rPr>
+          <w:b/>
+          <w:bCs/>
+        </w:rPr>
+        <w:t>viện</w:t>
+      </w:r>
+      <w:proofErr w:type="spellEnd"/>
+    </w:p>
+    <w:p/>
+    <w:p/>
+    <w:p/>
+    <w:p/>
+    <w:p/>
     <w:p>
       <w:pPr>
         <w:rPr>
@@ -29961,6 +31604,7 @@
   <w:style w:type="character" w:default="1" w:styleId="DefaultParagraphFont">
     <w:name w:val="Default Paragraph Font"/>
     <w:uiPriority w:val="1"/>
+    <w:semiHidden/>
     <w:unhideWhenUsed/>
   </w:style>
   <w:style w:type="table" w:default="1" w:styleId="TableNormal">

</xml_diff>